<commit_message>
FInal review and tasklist update
</commit_message>
<xml_diff>
--- a/Hw2/HW2G1Tasklist.docx
+++ b/Hw2/HW2G1Tasklist.docx
@@ -196,19 +196,34 @@
           <w:tcPr>
             <w:tcW w:w="3116" w:type="dxa"/>
           </w:tcPr>
-          <w:p/>
+          <w:p>
+            <w:r>
+              <w:t>John</w:t>
+            </w:r>
+          </w:p>
         </w:tc>
         <w:tc>
           <w:tcPr>
             <w:tcW w:w="3117" w:type="dxa"/>
           </w:tcPr>
-          <w:p/>
+          <w:p>
+            <w:r>
+              <w:t>3/1</w:t>
+            </w:r>
+            <w:r>
+              <w:t>6/26</w:t>
+            </w:r>
+          </w:p>
         </w:tc>
         <w:tc>
           <w:tcPr>
             <w:tcW w:w="3117" w:type="dxa"/>
           </w:tcPr>
-          <w:p/>
+          <w:p>
+            <w:r>
+              <w:t>Final walkthrough of Q3 and Q4</w:t>
+            </w:r>
+          </w:p>
         </w:tc>
       </w:tr>
       <w:tr>

</xml_diff>